<commit_message>
docs: add repository link to paper availability section
Co-Authored-By: Claude Opus 5.5 <noreply@anthropic.com>
</commit_message>
<xml_diff>
--- a/paper/draft_paper_id.docx
+++ b/paper/draft_paper_id.docx
@@ -16926,7 +16926,7 @@
       </w:pPr>
       <w:r>
         <w:rPr/>
-        <w:t xml:space="preserve">Paket keterulangan memuat seluruh kode (persiapan data, pembungkus model dengan revisi </w:t>
+        <w:t xml:space="preserve">Paket keterulangan tersedia di https://github.com/harrisonhys/Workload-forecasting dengan lisensi MIT. Paket ini memuat seluruh kode (persiapan data, pembungkus model dengan revisi </w:t>
       </w:r>
       <w:r>
         <w:rPr>
@@ -16946,7 +16946,7 @@
       </w:r>
       <w:r>
         <w:rPr/>
-        <w:t xml:space="preserve"> serta pengaturan model pembanding ada di configs/models.json. Keluaran pendukung mencakup metrik per deret untuk setiap model, hasil simulasi, pengukuran latensi, dan berkas CSV untuk setiap tabel dan gambar. Ramalan per origin (sekitar 1 GB) diarsipkan terpisah. Semua trace yang dipakai tersedia untuk publik dengan lisensi masing-masing, dan model Moirai-2.0-R-small berlisensi CC-BY-NC-4.0.</w:t>
+        <w:t xml:space="preserve"> serta pengaturan model pembanding ada di configs/models.json. Keluaran pendukung mencakup metrik per deret untuk setiap model, hasil simulasi, pengukuran latensi, dan berkas CSV untuk setiap tabel dan gambar. Ramalan per origin (sekitar 1 GB) tidak disimpan di repositori dan dapat dibangkitkan ulang dengan skrip yang sama. Semua trace yang dipakai tersedia untuk publik dengan lisensi masing-masing, dan model Moirai-2.0-R-small berlisensi CC-BY-NC-4.0.</w:t>
       </w:r>
     </w:p>
     <w:p>

</xml_diff>

<commit_message>
docs: cite Zenodo DOI for v0.5 in paper and README
Co-Authored-By: Claude Opus 5.5 <noreply@anthropic.com>
</commit_message>
<xml_diff>
--- a/paper/draft_paper_id.docx
+++ b/paper/draft_paper_id.docx
@@ -16926,7 +16926,7 @@
       </w:pPr>
       <w:r>
         <w:rPr/>
-        <w:t xml:space="preserve">Paket keterulangan tersedia di https://github.com/harrisonhys/Workload-forecasting dengan lisensi MIT. Paket ini memuat seluruh kode (persiapan data, pembungkus model dengan revisi </w:t>
+        <w:t xml:space="preserve">Paket keterulangan tersedia di https://github.com/harrisonhys/Workload-forecasting dengan lisensi MIT, dan versi yang dipakai dalam naskah ini (v0.5) diarsipkan di Zenodo dengan DOI https://doi.org/10.5281/zenodo.23662411. Paket ini memuat seluruh kode (persiapan data, pembungkus model dengan revisi </w:t>
       </w:r>
       <w:r>
         <w:rPr>
@@ -16946,7 +16946,7 @@
       </w:r>
       <w:r>
         <w:rPr/>
-        <w:t xml:space="preserve"> serta pengaturan model pembanding ada di configs/models.json. Keluaran pendukung mencakup metrik per deret untuk setiap model, hasil simulasi, pengukuran latensi, dan berkas CSV untuk setiap tabel dan gambar. Ramalan per origin (sekitar 1 GB) tidak disimpan di repositori dan dapat dibangkitkan ulang dengan skrip yang sama. Semua trace yang dipakai tersedia untuk publik dengan lisensi masing-masing, dan model Moirai-2.0-R-small berlisensi CC-BY-NC-4.0.</w:t>
+        <w:t xml:space="preserve"> serta pengaturan model pembanding ada di configs/models.json. Keluaran pendukung mencakup metrik per deret untuk setiap model, hasil simulasi, pengukuran latensi, dan berkas CSV untuk setiap tabel dan gambar. Ramalan per origin (sekitar 1 GB) dilampirkan pada rilis v0.5 di GitHub dalam enam berkas zip dengan checksum SHA-256, dan juga dapat dibangkitkan ulang dengan skrip yang sama. Semua trace yang dipakai tersedia untuk publik dengan lisensi masing-masing, dan model Moirai-2.0-R-small berlisensi CC-BY-NC-4.0.</w:t>
       </w:r>
     </w:p>
     <w:p>

</xml_diff>